<commit_message>
Regenerate TME_Template_2026.docx with cover-footer and title updates
Co-Authored-By: Claude Opus 4.7 (1M context) <noreply@anthropic.com>
</commit_message>
<xml_diff>
--- a/TME_Template_2026.docx
+++ b/TME_Template_2026.docx
@@ -1421,13 +1421,12 @@
       </w:tblCellMar>
     </w:tblPr>
     <w:tblGrid>
-      <w:gridCol w:w="7560"/>
-      <w:gridCol w:w="3240"/>
+      <w:gridCol w:w="10800"/>
     </w:tblGrid>
     <w:tr>
       <w:tc>
         <w:tcPr>
-          <w:tcW w:type="dxa" w:w="5400"/>
+          <w:tcW w:type="dxa" w:w="10800"/>
           <w:tcBorders>
             <w:top w:val="nil" w:sz="0" w:color="auto"/>
             <w:left w:val="nil" w:sz="0" w:color="auto"/>
@@ -1463,38 +1462,6 @@
               <w:sz w:val="16"/>
             </w:rPr>
             <w:t>[Author, A. (YYYY). Title. The Mathematics Educator, V(N), pp–pp.]</w:t>
-          </w:r>
-        </w:p>
-      </w:tc>
-      <w:tc>
-        <w:tcPr>
-          <w:tcW w:type="dxa" w:w="5400"/>
-          <w:tcBorders>
-            <w:top w:val="nil" w:sz="0" w:color="auto"/>
-            <w:left w:val="nil" w:sz="0" w:color="auto"/>
-            <w:bottom w:val="nil" w:sz="0" w:color="auto"/>
-            <w:right w:val="nil" w:sz="0" w:color="auto"/>
-          </w:tcBorders>
-          <w:shd w:val="clear" w:color="auto" w:fill="FAFAF7"/>
-          <w:tcMar>
-            <w:top w:w="120" w:type="dxa"/>
-            <w:bottom w:w="120" w:type="dxa"/>
-            <w:left w:w="120" w:type="dxa"/>
-            <w:right w:w="120" w:type="dxa"/>
-          </w:tcMar>
-        </w:tcPr>
-        <w:p>
-          <w:pPr>
-            <w:spacing w:before="0" w:after="0" w:line="288" w:lineRule="auto"/>
-            <w:jc w:val="right"/>
-          </w:pPr>
-          <w:r>
-            <w:rPr>
-              <w:rFonts w:ascii="Arial" w:hAnsi="Arial"/>
-              <w:color w:val="444444"/>
-              <w:sz w:val="16"/>
-            </w:rPr>
-            <w:t>CC BY 4.0  ·  © 2026 The Authors</w:t>
           </w:r>
         </w:p>
       </w:tc>
@@ -13659,7 +13626,7 @@
   <w:style w:type="paragraph" w:customStyle="1" w:styleId="TMETitle">
     <w:name w:val="TME Title"/>
     <w:pPr>
-      <w:spacing w:line="276" w:lineRule="auto" w:before="240" w:after="200"/>
+      <w:spacing w:line="276" w:lineRule="auto" w:before="480" w:after="200"/>
     </w:pPr>
     <w:rPr>
       <w:rFonts w:ascii="Georgia" w:hAnsi="Georgia"/>

</xml_diff>

<commit_message>
tagline.py: make gray panel actually reach the right page edge
python-docx's single-column table initializes the cell's tcW to the
normal content width (6.5"), not the full table grid width. Setting
table.columns[0].width updates the grid and the column object but
doesn't cascade to the cell's tcW, so Word rendered the gray fill
6.5" wide inside an 8.56" grid — the visible 2" gap on the right that
Jennifer flagged.

Explicitly setting the cell's tcW to the full 8.56" after
force_table_full_width closes the gap. The masthead wasn't affected
because its two-column setup triggers python-docx's normal
column-width propagation.

Also regenerated TME_Template_2026.docx to reflect the fix.

Co-Authored-By: Claude Opus 4.7 (1M context) <noreply@anthropic.com>
</commit_message>
<xml_diff>
--- a/TME_Template_2026.docx
+++ b/TME_Template_2026.docx
@@ -410,7 +410,7 @@
       <w:tr>
         <w:tc>
           <w:tcPr>
-            <w:tcW w:type="dxa" w:w="9360"/>
+            <w:tcW w:type="dxa" w:w="12330"/>
             <w:tcBorders>
               <w:top w:val="nil" w:sz="0" w:color="auto"/>
               <w:left w:val="nil" w:sz="0" w:color="auto"/>
@@ -955,7 +955,7 @@
       <w:tr>
         <w:tc>
           <w:tcPr>
-            <w:tcW w:type="dxa" w:w="9360"/>
+            <w:tcW w:type="dxa" w:w="12330"/>
             <w:tcBorders>
               <w:top w:val="nil" w:sz="0" w:color="auto"/>
               <w:left w:val="nil" w:sz="0" w:color="auto"/>
@@ -13684,7 +13684,7 @@
     <w:name w:val="TME Figure Caption"/>
     <w:pPr>
       <w:keepNext/>
-      <w:spacing w:before="360" w:after="120"/>
+      <w:spacing w:before="480" w:after="120"/>
       <w:jc w:val="left"/>
     </w:pPr>
     <w:rPr>
@@ -13697,7 +13697,7 @@
     <w:name w:val="TME Table Caption"/>
     <w:pPr>
       <w:keepNext/>
-      <w:spacing w:before="360" w:after="120"/>
+      <w:spacing w:before="480" w:after="120"/>
       <w:jc w:val="left"/>
     </w:pPr>
     <w:rPr>

</xml_diff>

<commit_message>
Captions: switch alignment from LEFT to CENTER
Editor preference after reviewing the Moore body proof. This is a
deliberate override of APA 7's flush-left caption spec — centered
reads better in the TME journal layout. Placement stays "above the
element" (APA 7) and keep_with_next still glues caption to figure/
table. Tests renamed to match the new assertion.

Co-Authored-By: Claude Opus 4.7 (1M context) <noreply@anthropic.com>
</commit_message>
<xml_diff>
--- a/TME_Template_2026.docx
+++ b/TME_Template_2026.docx
@@ -13685,7 +13685,7 @@
     <w:pPr>
       <w:keepNext/>
       <w:spacing w:before="480" w:after="120"/>
-      <w:jc w:val="left"/>
+      <w:jc w:val="center"/>
     </w:pPr>
     <w:rPr>
       <w:rFonts w:ascii="Georgia" w:hAnsi="Georgia"/>
@@ -13698,7 +13698,7 @@
     <w:pPr>
       <w:keepNext/>
       <w:spacing w:before="480" w:after="120"/>
-      <w:jc w:val="left"/>
+      <w:jc w:val="center"/>
     </w:pPr>
     <w:rPr>
       <w:rFonts w:ascii="Georgia" w:hAnsi="Georgia"/>

</xml_diff>